<commit_message>
Asset Management, Supply Chain Planning for Longhorn ERP
</commit_message>
<xml_diff>
--- a/projects/LonghornERP/02-requirements-engineering/01-srs/01-modules/LonghornERP_SRS_Assets.docx
+++ b/projects/LonghornERP/02-requirements-engineering/01-srs/01-modules/LonghornERP_SRS_Assets.docx
@@ -470,6 +470,14 @@
       </w:pPr>
       <w:r>
         <w:t xml:space="preserve">For vehicle assets, Asset Management remains the system of record for capital-asset accounting, depreciation, maintenance history, insurance and statutory compliance history, transfers, revaluation, and disposal. The Transportation module owns dispatch, trip execution, route planning, driver run assignment, shipment movement, and live fleet operations; any vehicle-operational data retained in Asset Management exists only to support asset history, maintenance planning, compliance evidence, and financial control.</w:t>
+      </w:r>
+    </w:p>
+    <w:p>
+      <w:pPr>
+        <w:pStyle w:val="BodyText"/>
+      </w:pPr>
+      <w:r>
+        <w:t xml:space="preserve">For non-vehicle physical assets, the module also acts as the enterprise asset-management control point for functional locations, asset criticality, work requests, work-order planning, reliability evidence, condition events, and maintenance-side MRO coordination. Inventory remains the stock authority, Procurement remains the purchasing authority, and Accounting remains the formal financial book of record.</w:t>
       </w:r>
     </w:p>
     <w:bookmarkEnd w:id="22"/>
@@ -1748,6 +1756,14 @@
         <w:t xml:space="preserve">Section 2 specifies the Asset Register requirements, including asset master data, categories, and QR/barcode tagging. Section 3 covers Depreciation (straight-line, reducing balance, GL posting, period lock). Section 4 defines Revaluation and Disposal requirements. Section 5 addresses Asset Transfers and Maintenance. Section 6 specifies Insurance Tracking and Physical Verification. Section 7 covers Book versus Tax Depreciation, deferred tax computation, and Vehicle Fleet Management. Section 8 lists Non-Functional Requirements. Section 9 presents the Traceability Matrix mapping every FR to a business goal.</w:t>
       </w:r>
     </w:p>
+    <w:p>
+      <w:pPr>
+        <w:pStyle w:val="BodyText"/>
+      </w:pPr>
+      <w:r>
+        <w:t xml:space="preserve">This revision additionally introduces Section 5A for enterprise work management and Section 6A for reliability, materials, and condition-management controls.</w:t>
+      </w:r>
+    </w:p>
     <w:bookmarkEnd w:id="25"/>
     <w:bookmarkStart w:id="26" w:name="X86c80e5c92427c6027d2d97ed85b3a2608dc173"/>
     <w:p>
@@ -1874,6 +1890,50 @@
       </w:r>
       <w:r>
         <w:t xml:space="preserve">Improve vehicle fleet utilisation and maintenance reliability through scheduled maintenance calendars, mileage tracking, and fuel consumption logs.</w:t>
+      </w:r>
+    </w:p>
+    <w:p>
+      <w:pPr>
+        <w:pStyle w:val="Compact"/>
+        <w:numPr>
+          <w:ilvl w:val="0"/>
+          <w:numId w:val="1002"/>
+        </w:numPr>
+      </w:pPr>
+      <w:r>
+        <w:rPr>
+          <w:b/>
+          <w:bCs/>
+        </w:rPr>
+        <w:t xml:space="preserve">BG-ASSET-006:</w:t>
+      </w:r>
+      <w:r>
+        <w:t xml:space="preserve"> </w:t>
+      </w:r>
+      <w:r>
+        <w:t xml:space="preserve">Improve maintenance planning discipline, schedule compliance, and uptime for critical physical assets.</w:t>
+      </w:r>
+    </w:p>
+    <w:p>
+      <w:pPr>
+        <w:pStyle w:val="Compact"/>
+        <w:numPr>
+          <w:ilvl w:val="0"/>
+          <w:numId w:val="1002"/>
+        </w:numPr>
+      </w:pPr>
+      <w:r>
+        <w:rPr>
+          <w:b/>
+          <w:bCs/>
+        </w:rPr>
+        <w:t xml:space="preserve">BG-ASSET-007:</w:t>
+      </w:r>
+      <w:r>
+        <w:t xml:space="preserve"> </w:t>
+      </w:r>
+      <w:r>
+        <w:t xml:space="preserve">Improve repair-versus-replace and reliability decisions through structured failure history, condition evidence, and maintenance analytics.</w:t>
       </w:r>
     </w:p>
     <w:bookmarkEnd w:id="26"/>
@@ -4946,16 +5006,178 @@
     </w:p>
     <w:bookmarkEnd w:id="54"/>
     <w:bookmarkEnd w:id="55"/>
-    <w:bookmarkStart w:id="59" w:name="X0f4fbdcea55306eb246d414521dce7b2676ec3f"/>
+    <w:bookmarkStart w:id="56" w:name="enterprise-work-management"/>
     <w:p>
       <w:pPr>
         <w:pStyle w:val="Heading1"/>
       </w:pPr>
       <w:r>
+        <w:t xml:space="preserve">Enterprise Work Management</w:t>
+      </w:r>
+    </w:p>
+    <w:p>
+      <w:pPr>
+        <w:pStyle w:val="FirstParagraph"/>
+      </w:pPr>
+      <w:r>
+        <w:t xml:space="preserve">This section extends the module from maintenance reminders into structured enterprise work management.</w:t>
+      </w:r>
+    </w:p>
+    <w:p>
+      <w:pPr>
+        <w:pStyle w:val="BodyText"/>
+      </w:pPr>
+      <w:r>
+        <w:rPr>
+          <w:b/>
+          <w:bCs/>
+        </w:rPr>
+        <w:t xml:space="preserve">FR-ASSET-069:</w:t>
+      </w:r>
+      <w:r>
+        <w:t xml:space="preserve"> </w:t>
+      </w:r>
+      <w:r>
+        <w:t xml:space="preserve">The system shall allow an authorised user to define functional locations and parent-child asset hierarchies, and every maintainable asset shall be assignable to exactly 1 active functional location.</w:t>
+      </w:r>
+    </w:p>
+    <w:p>
+      <w:pPr>
+        <w:pStyle w:val="BodyText"/>
+      </w:pPr>
+      <w:r>
+        <w:rPr>
+          <w:b/>
+          <w:bCs/>
+        </w:rPr>
+        <w:t xml:space="preserve">FR-ASSET-070:</w:t>
+      </w:r>
+      <w:r>
+        <w:t xml:space="preserve"> </w:t>
+      </w:r>
+      <w:r>
+        <w:t xml:space="preserve">The system shall require each maintainable asset to carry a criticality classification using a tenant-defined scale, and work priority rules shall reference asset criticality when calculating recommended response and schedule windows.</w:t>
+      </w:r>
+    </w:p>
+    <w:p>
+      <w:pPr>
+        <w:pStyle w:val="BodyText"/>
+      </w:pPr>
+      <w:r>
+        <w:rPr>
+          <w:b/>
+          <w:bCs/>
+        </w:rPr>
+        <w:t xml:space="preserve">FR-ASSET-071:</w:t>
+      </w:r>
+      <w:r>
+        <w:t xml:space="preserve"> </w:t>
+      </w:r>
+      <w:r>
+        <w:t xml:space="preserve">The system shall provide a work-request intake process through which operators, supervisors, or authorised technicians may submit a maintenance request containing asset, symptom, problem description, requested date, and optional photo or meter evidence; the system shall detect and flag potential duplicates against open requests for the same asset and issue category.</w:t>
+      </w:r>
+    </w:p>
+    <w:p>
+      <w:pPr>
+        <w:pStyle w:val="BodyText"/>
+      </w:pPr>
+      <w:r>
+        <w:rPr>
+          <w:b/>
+          <w:bCs/>
+        </w:rPr>
+        <w:t xml:space="preserve">FR-ASSET-072:</w:t>
+      </w:r>
+      <w:r>
+        <w:t xml:space="preserve"> </w:t>
+      </w:r>
+      <w:r>
+        <w:t xml:space="preserve">The system shall allow an authorised planner or supervisor to screen a work request and either reject it with reason, convert it to a work order, or merge it into an existing work order, and each screening decision shall be audit logged.</w:t>
+      </w:r>
+    </w:p>
+    <w:p>
+      <w:pPr>
+        <w:pStyle w:val="BodyText"/>
+      </w:pPr>
+      <w:r>
+        <w:rPr>
+          <w:b/>
+          <w:bCs/>
+        </w:rPr>
+        <w:t xml:space="preserve">FR-ASSET-073:</w:t>
+      </w:r>
+      <w:r>
+        <w:t xml:space="preserve"> </w:t>
+      </w:r>
+      <w:r>
+        <w:t xml:space="preserve">When a work order is planned, the system shall support a planning package containing task list, estimated labour hours, required skills, required materials, safety instructions, permit requirements, and target schedule window.</w:t>
+      </w:r>
+    </w:p>
+    <w:p>
+      <w:pPr>
+        <w:pStyle w:val="BodyText"/>
+      </w:pPr>
+      <w:r>
+        <w:rPr>
+          <w:b/>
+          <w:bCs/>
+        </w:rPr>
+        <w:t xml:space="preserve">FR-ASSET-074:</w:t>
+      </w:r>
+      <w:r>
+        <w:t xml:space="preserve"> </w:t>
+      </w:r>
+      <w:r>
+        <w:t xml:space="preserve">The system shall provide a weekly scheduling board that assigns planned work orders to crews, technicians, or contractors based on labour capacity, planned duration, asset criticality, and required shutdown windows, and it shall prevent over-allocation unless an authorised scheduler records an override reason.</w:t>
+      </w:r>
+    </w:p>
+    <w:p>
+      <w:pPr>
+        <w:pStyle w:val="BodyText"/>
+      </w:pPr>
+      <w:r>
+        <w:rPr>
+          <w:b/>
+          <w:bCs/>
+        </w:rPr>
+        <w:t xml:space="preserve">FR-ASSET-075:</w:t>
+      </w:r>
+      <w:r>
+        <w:t xml:space="preserve"> </w:t>
+      </w:r>
+      <w:r>
+        <w:t xml:space="preserve">Every work order shall store whether it is planned or unplanned work, and the system shall calculate backlog age in calendar days from screening date until completion or cancellation.</w:t>
+      </w:r>
+    </w:p>
+    <w:p>
+      <w:pPr>
+        <w:pStyle w:val="BodyText"/>
+      </w:pPr>
+      <w:r>
+        <w:rPr>
+          <w:b/>
+          <w:bCs/>
+        </w:rPr>
+        <w:t xml:space="preserve">FR-ASSET-076:</w:t>
+      </w:r>
+      <w:r>
+        <w:t xml:space="preserve"> </w:t>
+      </w:r>
+      <w:r>
+        <w:t xml:space="preserve">The system shall allow an authorised planner to group work orders into a shutdown or turnaround package with shared window, area, coordinator, and readiness status, and packaged work orders shall expose a consolidated readiness summary before execution begins.</w:t>
+      </w:r>
+    </w:p>
+    <w:bookmarkEnd w:id="56"/>
+    <w:bookmarkStart w:id="60" w:name="X0f4fbdcea55306eb246d414521dce7b2676ec3f"/>
+    <w:p>
+      <w:pPr>
+        <w:pStyle w:val="Heading1"/>
+      </w:pPr>
+      <w:r>
         <w:t xml:space="preserve">Insurance Tracking and Physical Verification — Policy Records, Renewal Alerts, and Scan Workflow</w:t>
       </w:r>
     </w:p>
-    <w:bookmarkStart w:id="56" w:name="Xdb47e599aadb572582bcb9ea2176f19395e80b1"/>
+    <w:bookmarkStart w:id="57" w:name="Xdb47e599aadb572582bcb9ea2176f19395e80b1"/>
     <w:p>
       <w:pPr>
         <w:pStyle w:val="Heading2"/>
@@ -4972,8 +5194,8 @@
         <w:t xml:space="preserve">Insurance tracking records the insurance coverage attached to each asset, ensuring that policies are renewed before expiry. Physical verification provides a structured scan-based workflow that confirms assets are present at their recorded locations, flags missing or misplaced assets, and generates a discrepancy report for management action.</w:t>
       </w:r>
     </w:p>
-    <w:bookmarkEnd w:id="56"/>
-    <w:bookmarkStart w:id="57" w:name="X1219b0519a656656faacad2664d3d0c246d6402"/>
+    <w:bookmarkEnd w:id="57"/>
+    <w:bookmarkStart w:id="58" w:name="X1219b0519a656656faacad2664d3d0c246d6402"/>
     <w:p>
       <w:pPr>
         <w:pStyle w:val="Heading2"/>
@@ -5196,8 +5418,8 @@
         <w:t xml:space="preserve">When an authorised user requests the Insurance Expiry Report, the system shall return a list of all asset insurance records with expiry date ≤ 90 days from the report date, sorted by days-to-expiry ascending, and support export to Excel (.xlsx) and PDF within ≤ 5 seconds at P95 for up to 1,000 policy records.</w:t>
       </w:r>
     </w:p>
-    <w:bookmarkEnd w:id="57"/>
-    <w:bookmarkStart w:id="58" w:name="Xdfa733c0318bac7497d2dded7f97f48b857666e"/>
+    <w:bookmarkEnd w:id="58"/>
+    <w:bookmarkStart w:id="59" w:name="Xdfa733c0318bac7497d2dded7f97f48b857666e"/>
     <w:p>
       <w:pPr>
         <w:pStyle w:val="Heading2"/>
@@ -5359,18 +5581,162 @@
         <w:t xml:space="preserve">, with counts and percentages for each category; the report shall be exportable to PDF and Excel and available within ≤ 10 seconds at P95 for a session scope of up to 5,000 assets.</w:t>
       </w:r>
     </w:p>
-    <w:bookmarkEnd w:id="58"/>
     <w:bookmarkEnd w:id="59"/>
-    <w:bookmarkStart w:id="65" w:name="X3842186189f43e477eb616c08acd384c3a55e40"/>
+    <w:bookmarkEnd w:id="60"/>
+    <w:bookmarkStart w:id="61" w:name="X955d44ba79e4f9d7352bf326523e37d84d0ae94"/>
     <w:p>
       <w:pPr>
         <w:pStyle w:val="Heading1"/>
       </w:pPr>
       <w:r>
+        <w:t xml:space="preserve">Reliability, Materials, and Condition Management</w:t>
+      </w:r>
+    </w:p>
+    <w:p>
+      <w:pPr>
+        <w:pStyle w:val="FirstParagraph"/>
+      </w:pPr>
+      <w:r>
+        <w:t xml:space="preserve">This section defines the reliability and condition-management capabilities expected of an enterprise asset-management workflow.</w:t>
+      </w:r>
+    </w:p>
+    <w:p>
+      <w:pPr>
+        <w:pStyle w:val="BodyText"/>
+      </w:pPr>
+      <w:r>
+        <w:rPr>
+          <w:b/>
+          <w:bCs/>
+        </w:rPr>
+        <w:t xml:space="preserve">FR-ASSET-077:</w:t>
+      </w:r>
+      <w:r>
+        <w:t xml:space="preserve"> </w:t>
+      </w:r>
+      <w:r>
+        <w:t xml:space="preserve">When a planned work order requires stocked materials, the system shall reserve the required item quantities from Inventory against the work order and show reservation status, short quantity, and staging location on the work-order material list.</w:t>
+      </w:r>
+    </w:p>
+    <w:p>
+      <w:pPr>
+        <w:pStyle w:val="BodyText"/>
+      </w:pPr>
+      <w:r>
+        <w:rPr>
+          <w:b/>
+          <w:bCs/>
+        </w:rPr>
+        <w:t xml:space="preserve">FR-ASSET-078:</w:t>
+      </w:r>
+      <w:r>
+        <w:t xml:space="preserve"> </w:t>
+      </w:r>
+      <w:r>
+        <w:t xml:space="preserve">When a required work-order material is unavailable in free stock, the system shall flag a material-shortage exception and optionally create a linked procurement request or stock-transfer request without altering the work-order scope.</w:t>
+      </w:r>
+    </w:p>
+    <w:p>
+      <w:pPr>
+        <w:pStyle w:val="BodyText"/>
+      </w:pPr>
+      <w:r>
+        <w:rPr>
+          <w:b/>
+          <w:bCs/>
+        </w:rPr>
+        <w:t xml:space="preserve">FR-ASSET-079:</w:t>
+      </w:r>
+      <w:r>
+        <w:t xml:space="preserve"> </w:t>
+      </w:r>
+      <w:r>
+        <w:t xml:space="preserve">The system shall accept validated condition events from meter readings, inspection forms, or external telemetry sources and evaluate them against asset-specific or category-default thresholds to determine whether monitoring, inspection, or corrective work is required.</w:t>
+      </w:r>
+    </w:p>
+    <w:p>
+      <w:pPr>
+        <w:pStyle w:val="BodyText"/>
+      </w:pPr>
+      <w:r>
+        <w:rPr>
+          <w:b/>
+          <w:bCs/>
+        </w:rPr>
+        <w:t xml:space="preserve">FR-ASSET-080:</w:t>
+      </w:r>
+      <w:r>
+        <w:t xml:space="preserve"> </w:t>
+      </w:r>
+      <w:r>
+        <w:t xml:space="preserve">When a work order is closed, the system shall require structured closeout data including failure code, cause code, remedy code, actual labour hours, materials consumed, completion notes, and completion timestamp; closeout without these mandatory fields shall be rejected for work orders classified as corrective or breakdown work.</w:t>
+      </w:r>
+    </w:p>
+    <w:p>
+      <w:pPr>
+        <w:pStyle w:val="BodyText"/>
+      </w:pPr>
+      <w:r>
+        <w:rPr>
+          <w:b/>
+          <w:bCs/>
+        </w:rPr>
+        <w:t xml:space="preserve">FR-ASSET-081:</w:t>
+      </w:r>
+      <w:r>
+        <w:t xml:space="preserve"> </w:t>
+      </w:r>
+      <w:r>
+        <w:t xml:space="preserve">The system shall provide reliability dashboards showing at minimum PM compliance, planned-versus-unplanned work ratio, schedule compliance, backlog age by priority, mean time between failures (MTBF), and mean time to repair (MTTR) for a user-authorised scope and date range.</w:t>
+      </w:r>
+    </w:p>
+    <w:p>
+      <w:pPr>
+        <w:pStyle w:val="BodyText"/>
+      </w:pPr>
+      <w:r>
+        <w:rPr>
+          <w:b/>
+          <w:bCs/>
+        </w:rPr>
+        <w:t xml:space="preserve">FR-ASSET-082:</w:t>
+      </w:r>
+      <w:r>
+        <w:t xml:space="preserve"> </w:t>
+      </w:r>
+      <w:r>
+        <w:t xml:space="preserve">The system shall identify repeat-failure or bad-actor assets by configurable thresholds on breakdown count, repeat failure code, downtime impact, or maintenance cost trend, and it shall allow an authorised user to open a root-cause analysis workflow linked to the relevant asset and failure history.</w:t>
+      </w:r>
+    </w:p>
+    <w:p>
+      <w:pPr>
+        <w:pStyle w:val="BodyText"/>
+      </w:pPr>
+      <w:r>
+        <w:rPr>
+          <w:b/>
+          <w:bCs/>
+        </w:rPr>
+        <w:t xml:space="preserve">FR-ASSET-083:</w:t>
+      </w:r>
+      <w:r>
+        <w:t xml:space="preserve"> </w:t>
+      </w:r>
+      <w:r>
+        <w:t xml:space="preserve">The system shall support technician mobile work execution, including offline capture of start time, stop time, checklist completion, meter readings, parts usage, photos, and completion notes; offline records shall synchronise automatically when connectivity is restored.</w:t>
+      </w:r>
+    </w:p>
+    <w:bookmarkEnd w:id="61"/>
+    <w:bookmarkStart w:id="67" w:name="X3842186189f43e477eb616c08acd384c3a55e40"/>
+    <w:p>
+      <w:pPr>
+        <w:pStyle w:val="Heading1"/>
+      </w:pPr>
+      <w:r>
         <w:t xml:space="preserve">Book vs. Tax Depreciation, Deferred Tax, and Vehicle Fleet Management</w:t>
       </w:r>
     </w:p>
-    <w:bookmarkStart w:id="60" w:name="Xd5aa20d3879535509f670caba433c6ff498c106"/>
+    <w:bookmarkStart w:id="62" w:name="Xd5aa20d3879535509f670caba433c6ff498c106"/>
     <w:p>
       <w:pPr>
         <w:pStyle w:val="Heading2"/>
@@ -5395,8 +5761,8 @@
         <w:t xml:space="preserve">Within Longhorn ERP, the Vehicle Fleet sub-ledger in Asset Management exists to preserve vehicle capital-asset records, depreciation, maintenance history, insurance and regulatory compliance history, and other auditable ownership data. The Transportation module is the source of truth for dispatch, trips, routes, driver movement control, consignment movement, and live fleet operations. Where operational events are reflected here, they are retained only as supporting records for asset stewardship, maintenance planning, compliance evidence, and financial auditability.</w:t>
       </w:r>
     </w:p>
-    <w:bookmarkEnd w:id="60"/>
-    <w:bookmarkStart w:id="63" w:name="Xfc7132eaf5e1f7cffba5b308ba177d5b8bf17ef"/>
+    <w:bookmarkEnd w:id="62"/>
+    <w:bookmarkStart w:id="65" w:name="Xfc7132eaf5e1f7cffba5b308ba177d5b8bf17ef"/>
     <w:p>
       <w:pPr>
         <w:pStyle w:val="Heading2"/>
@@ -5405,7 +5771,7 @@
         <w:t xml:space="preserve">7.2 Book vs. Tax Depreciation</w:t>
       </w:r>
     </w:p>
-    <w:bookmarkStart w:id="61" w:name="Xb98d385738c04aaf392c676634156456c1cc163"/>
+    <w:bookmarkStart w:id="63" w:name="Xb98d385738c04aaf392c676634156456c1cc163"/>
     <w:p>
       <w:pPr>
         <w:pStyle w:val="Heading3"/>
@@ -5454,8 +5820,8 @@
         <w:t xml:space="preserve">is its NBV per the books. Where the carrying amount exceeds the tax base, a deferred tax liability arises.</w:t>
       </w:r>
     </w:p>
-    <w:bookmarkEnd w:id="61"/>
-    <w:bookmarkStart w:id="62" w:name="X9e789c130262e52fae2212849d7231c1efb878d"/>
+    <w:bookmarkEnd w:id="63"/>
+    <w:bookmarkStart w:id="64" w:name="X9e789c130262e52fae2212849d7231c1efb878d"/>
     <w:p>
       <w:pPr>
         <w:pStyle w:val="Heading3"/>
@@ -5967,9 +6333,9 @@
         <w:t xml:space="preserve">When the URA tax depreciation rate for a category is updated, the system shall apply the new rate prospectively from the next depreciation run; historical tax depreciation records shall not be recalculated.</w:t>
       </w:r>
     </w:p>
-    <w:bookmarkEnd w:id="62"/>
-    <w:bookmarkEnd w:id="63"/>
-    <w:bookmarkStart w:id="64" w:name="Xe0f298d10c1e0b230f911e5fb66494cdc8190b5"/>
+    <w:bookmarkEnd w:id="64"/>
+    <w:bookmarkEnd w:id="65"/>
+    <w:bookmarkStart w:id="66" w:name="Xe0f298d10c1e0b230f911e5fb66494cdc8190b5"/>
     <w:p>
       <w:pPr>
         <w:pStyle w:val="Heading2"/>
@@ -6139,9 +6505,9 @@
         <w:t xml:space="preserve">When an authorised user requests the Fleet Utilisation Report for a selected date range, the system shall return a per-vehicle summary showing: total km travelled, total fuel consumed (litres), average fuel efficiency (L/100 km), total fuel cost, number of trips, number of services, total service cost, and current odometer reading; the report shall be exportable to Excel and PDF within ≤ 10 seconds at P95 for up to 500 vehicles.</w:t>
       </w:r>
     </w:p>
-    <w:bookmarkEnd w:id="64"/>
-    <w:bookmarkEnd w:id="65"/>
-    <w:bookmarkStart w:id="81" w:name="Xbbebe4760abda4a0ba594eacbb82ad18bf26b4f"/>
+    <w:bookmarkEnd w:id="66"/>
+    <w:bookmarkEnd w:id="67"/>
+    <w:bookmarkStart w:id="83" w:name="Xbbebe4760abda4a0ba594eacbb82ad18bf26b4f"/>
     <w:p>
       <w:pPr>
         <w:pStyle w:val="Heading1"/>
@@ -6150,7 +6516,7 @@
         <w:t xml:space="preserve">Assets and Accounting Finance Integration</w:t>
       </w:r>
     </w:p>
-    <w:bookmarkStart w:id="66" w:name="Xe656c7b6450ec476f453091ff6f524ec7bd654f"/>
+    <w:bookmarkStart w:id="68" w:name="Xe656c7b6450ec476f453091ff6f524ec7bd654f"/>
     <w:p>
       <w:pPr>
         <w:pStyle w:val="Heading2"/>
@@ -6197,8 +6563,8 @@
         <w:t xml:space="preserve">module for fixed asset accounting. The objective is to ensure that LonghornERP supports operational asset management without weakening capitalization discipline, depreciation governance, impairment control, retirement accounting, or general ledger integrity.</w:t>
       </w:r>
     </w:p>
-    <w:bookmarkEnd w:id="66"/>
-    <w:bookmarkStart w:id="70" w:name="X20c970785acb2b8d8f69352d532fb94f96a5c3e"/>
+    <w:bookmarkEnd w:id="68"/>
+    <w:bookmarkStart w:id="72" w:name="X20c970785acb2b8d8f69352d532fb94f96a5c3e"/>
     <w:p>
       <w:pPr>
         <w:pStyle w:val="Heading2"/>
@@ -6207,7 +6573,7 @@
         <w:t xml:space="preserve">2. Ownership Boundary</w:t>
       </w:r>
     </w:p>
-    <w:bookmarkStart w:id="67" w:name="Xf8e954f62892b56c846809b8c5a701016d8ed43"/>
+    <w:bookmarkStart w:id="69" w:name="Xf8e954f62892b56c846809b8c5a701016d8ed43"/>
     <w:p>
       <w:pPr>
         <w:pStyle w:val="Heading3"/>
@@ -6338,8 +6704,8 @@
         <w:t xml:space="preserve">disposal workflow initiation and operational evidence such as photos, inspection notes, auction references, or handover records</w:t>
       </w:r>
     </w:p>
-    <w:bookmarkEnd w:id="67"/>
-    <w:bookmarkStart w:id="68" w:name="X23af5e5e61e2949cdf05acc6077a2bd2bb23bb1"/>
+    <w:bookmarkEnd w:id="69"/>
+    <w:bookmarkStart w:id="70" w:name="X23af5e5e61e2949cdf05acc6077a2bd2bb23bb1"/>
     <w:p>
       <w:pPr>
         <w:pStyle w:val="Heading3"/>
@@ -6494,8 +6860,8 @@
         <w:t xml:space="preserve">all asset-related journal generation and posting to the general ledger</w:t>
       </w:r>
     </w:p>
-    <w:bookmarkEnd w:id="68"/>
-    <w:bookmarkStart w:id="69" w:name="Xe558dffcc8a95a0fd662d9a1b69a7c02d057b7c"/>
+    <w:bookmarkEnd w:id="70"/>
+    <w:bookmarkStart w:id="71" w:name="Xe558dffcc8a95a0fd662d9a1b69a7c02d057b7c"/>
     <w:p>
       <w:pPr>
         <w:pStyle w:val="Heading3"/>
@@ -6542,9 +6908,9 @@
         <w:t xml:space="preserve">module shall determine book treatment and post financial entries.</w:t>
       </w:r>
     </w:p>
-    <w:bookmarkEnd w:id="69"/>
-    <w:bookmarkEnd w:id="70"/>
-    <w:bookmarkStart w:id="75" w:name="Xe7303fedc1caa0f98a54d3d573fddb57a70f32c"/>
+    <w:bookmarkEnd w:id="71"/>
+    <w:bookmarkEnd w:id="72"/>
+    <w:bookmarkStart w:id="77" w:name="Xe7303fedc1caa0f98a54d3d573fddb57a70f32c"/>
     <w:p>
       <w:pPr>
         <w:pStyle w:val="Heading2"/>
@@ -6553,7 +6919,7 @@
         <w:t xml:space="preserve">3. Functional Requirements</w:t>
       </w:r>
     </w:p>
-    <w:bookmarkStart w:id="71" w:name="X857993af4c13898e8219ed84c869037ebd88a60"/>
+    <w:bookmarkStart w:id="73" w:name="X857993af4c13898e8219ed84c869037ebd88a60"/>
     <w:p>
       <w:pPr>
         <w:pStyle w:val="Heading3"/>
@@ -6667,8 +7033,8 @@
         <w:t xml:space="preserve">confirms capitalization policy, depreciation parameters, and posting readiness before the asset becomes a depreciable accounting asset.</w:t>
       </w:r>
     </w:p>
-    <w:bookmarkEnd w:id="71"/>
-    <w:bookmarkStart w:id="72" w:name="Xd5ac31b050fab401fb1b1c659d1aaec399efd17"/>
+    <w:bookmarkEnd w:id="73"/>
+    <w:bookmarkStart w:id="74" w:name="Xd5ac31b050fab401fb1b1c659d1aaec399efd17"/>
     <w:p>
       <w:pPr>
         <w:pStyle w:val="Heading3"/>
@@ -6806,8 +7172,8 @@
         <w:t xml:space="preserve">approval or rejection is recorded.</w:t>
       </w:r>
     </w:p>
-    <w:bookmarkEnd w:id="72"/>
-    <w:bookmarkStart w:id="73" w:name="X3f62596ff8178934c825b8b51309e5c3b59e7b2"/>
+    <w:bookmarkEnd w:id="74"/>
+    <w:bookmarkStart w:id="75" w:name="X3f62596ff8178934c825b8b51309e5c3b59e7b2"/>
     <w:p>
       <w:pPr>
         <w:pStyle w:val="Heading3"/>
@@ -6909,8 +7275,8 @@
         <w:t xml:space="preserve">An asset shall not move to final disposed status in the enterprise record until finance retirement processing is completed or explicitly waived under an authorized policy.</w:t>
       </w:r>
     </w:p>
-    <w:bookmarkEnd w:id="73"/>
-    <w:bookmarkStart w:id="74" w:name="X8d4359bd01e48163ef34d46fc926f494bc57f28"/>
+    <w:bookmarkEnd w:id="75"/>
+    <w:bookmarkStart w:id="76" w:name="X8d4359bd01e48163ef34d46fc926f494bc57f28"/>
     <w:p>
       <w:pPr>
         <w:pStyle w:val="Heading3"/>
@@ -7012,9 +7378,9 @@
         <w:t xml:space="preserve">The system shall preserve both the operational custody trail and the accounting ownership trail when they differ.</w:t>
       </w:r>
     </w:p>
-    <w:bookmarkEnd w:id="74"/>
-    <w:bookmarkEnd w:id="75"/>
-    <w:bookmarkStart w:id="78" w:name="Xf2c73d5f3b60e3d4e04b04fea2c2673c65c69e3"/>
+    <w:bookmarkEnd w:id="76"/>
+    <w:bookmarkEnd w:id="77"/>
+    <w:bookmarkStart w:id="80" w:name="Xf2c73d5f3b60e3d4e04b04fea2c2673c65c69e3"/>
     <w:p>
       <w:pPr>
         <w:pStyle w:val="Heading2"/>
@@ -7023,7 +7389,7 @@
         <w:t xml:space="preserve">4. Required Integration Events and Data</w:t>
       </w:r>
     </w:p>
-    <w:bookmarkStart w:id="76" w:name="X2b4940f5e54b6e6f03724b203d24667eeee9017"/>
+    <w:bookmarkStart w:id="78" w:name="X2b4940f5e54b6e6f03724b203d24667eeee9017"/>
     <w:p>
       <w:pPr>
         <w:pStyle w:val="Heading3"/>
@@ -7282,8 +7648,8 @@
         <w:t xml:space="preserve">supporting document or evidence references where available</w:t>
       </w:r>
     </w:p>
-    <w:bookmarkEnd w:id="76"/>
-    <w:bookmarkStart w:id="77" w:name="X05785170a8bafdf31968e70036ccfa5a57795fd"/>
+    <w:bookmarkEnd w:id="78"/>
+    <w:bookmarkStart w:id="79" w:name="X05785170a8bafdf31968e70036ccfa5a57795fd"/>
     <w:p>
       <w:pPr>
         <w:pStyle w:val="Heading3"/>
@@ -7458,9 +7824,9 @@
         <w:t xml:space="preserve">Each outcome shall include status, decision actor, decision timestamp, finance reference number, and any rejection or exception reason needed by operations.</w:t>
       </w:r>
     </w:p>
-    <w:bookmarkEnd w:id="77"/>
-    <w:bookmarkEnd w:id="78"/>
-    <w:bookmarkStart w:id="79" w:name="X1b030c95ac195d98cda29873c9abb75c797946b"/>
+    <w:bookmarkEnd w:id="79"/>
+    <w:bookmarkEnd w:id="80"/>
+    <w:bookmarkStart w:id="81" w:name="X1b030c95ac195d98cda29873c9abb75c797946b"/>
     <w:p>
       <w:pPr>
         <w:pStyle w:val="Heading2"/>
@@ -7595,8 +7961,8 @@
         <w:t xml:space="preserve">The system shall surface exceptions where operational status and accounting status diverge, including assets disposed operationally but not retired financially, or assets in service operationally but not yet capitalized.</w:t>
       </w:r>
     </w:p>
-    <w:bookmarkEnd w:id="79"/>
-    <w:bookmarkStart w:id="80" w:name="Xc66951254dc2a1d460ff53d473ba047b38a3be9"/>
+    <w:bookmarkEnd w:id="81"/>
+    <w:bookmarkStart w:id="82" w:name="Xc66951254dc2a1d460ff53d473ba047b38a3be9"/>
     <w:p>
       <w:pPr>
         <w:pStyle w:val="Heading2"/>
@@ -7643,9 +8009,9 @@
         <w:t xml:space="preserve">as the financial system of record for fixed asset accounting treatment and ledger impact. This separation shall preserve operational agility while enforcing finance control, auditability, and policy compliance.</w:t>
       </w:r>
     </w:p>
-    <w:bookmarkEnd w:id="80"/>
-    <w:bookmarkEnd w:id="81"/>
-    <w:bookmarkStart w:id="89" w:name="Xd05af83c80cd22d042c1692e75ede8c8007f8d2"/>
+    <w:bookmarkEnd w:id="82"/>
+    <w:bookmarkEnd w:id="83"/>
+    <w:bookmarkStart w:id="92" w:name="Xd05af83c80cd22d042c1692e75ede8c8007f8d2"/>
     <w:p>
       <w:pPr>
         <w:pStyle w:val="Heading1"/>
@@ -7654,7 +8020,7 @@
         <w:t xml:space="preserve">Non-Functional Requirements for the Asset Management Module</w:t>
       </w:r>
     </w:p>
-    <w:bookmarkStart w:id="82" w:name="Xb7098ebaaf819d6abd58f799a3d20a357dc8c7e"/>
+    <w:bookmarkStart w:id="84" w:name="Xb7098ebaaf819d6abd58f799a3d20a357dc8c7e"/>
     <w:p>
       <w:pPr>
         <w:pStyle w:val="Heading2"/>
@@ -7686,8 +8052,8 @@
         <w:t xml:space="preserve">series and states a specific, measurable metric per IEEE 982.1. No NFR uses vague qualifiers such as "fast," "reliable," or "robust" without a defined threshold.</w:t>
       </w:r>
     </w:p>
-    <w:bookmarkEnd w:id="82"/>
-    <w:bookmarkStart w:id="83" w:name="Xba7757474cec97284092bff1794da0d993ded98"/>
+    <w:bookmarkEnd w:id="84"/>
+    <w:bookmarkStart w:id="85" w:name="Xba7757474cec97284092bff1794da0d993ded98"/>
     <w:p>
       <w:pPr>
         <w:pStyle w:val="Heading2"/>
@@ -7786,8 +8152,8 @@
         <w:t xml:space="preserve">The system shall render a batch asset QR label PDF for up to 200 assets within ≤ 10 seconds at P95.</w:t>
       </w:r>
     </w:p>
-    <w:bookmarkEnd w:id="83"/>
-    <w:bookmarkStart w:id="84" w:name="X908738f7324b962691bdf0bc9029b22dc65a4b1"/>
+    <w:bookmarkEnd w:id="85"/>
+    <w:bookmarkStart w:id="86" w:name="X908738f7324b962691bdf0bc9029b22dc65a4b1"/>
     <w:p>
       <w:pPr>
         <w:pStyle w:val="Heading2"/>
@@ -7941,8 +8307,8 @@
         <w:t xml:space="preserve">; the depreciation run shall enforce this ceiling per FR-ASSET-015 and log an anomaly alert if the ceiling is approached within 1% of the remaining depreciable amount.</w:t>
       </w:r>
     </w:p>
-    <w:bookmarkEnd w:id="84"/>
-    <w:bookmarkStart w:id="85" w:name="Xb24aa6196b0344bce080358c01353764329eea3"/>
+    <w:bookmarkEnd w:id="86"/>
+    <w:bookmarkStart w:id="87" w:name="Xb24aa6196b0344bce080358c01353764329eea3"/>
     <w:p>
       <w:pPr>
         <w:pStyle w:val="Heading2"/>
@@ -7987,8 +8353,8 @@
         <w:t xml:space="preserve">The depreciation run scheduler shall be fault-tolerant: if a scheduled run is interrupted by a server restart, the system shall detect the interrupted run on next startup and either complete or cleanly roll it back, with no partial postings left in the database.</w:t>
       </w:r>
     </w:p>
-    <w:bookmarkEnd w:id="85"/>
-    <w:bookmarkStart w:id="86" w:name="X5da63968127c9eb892549b40376c6d881a314c7"/>
+    <w:bookmarkEnd w:id="87"/>
+    <w:bookmarkStart w:id="88" w:name="X5da63968127c9eb892549b40376c6d881a314c7"/>
     <w:p>
       <w:pPr>
         <w:pStyle w:val="Heading2"/>
@@ -8099,8 +8465,8 @@
         <w:t xml:space="preserve">parameter in the request body or URL shall be ignored and an anomaly event shall be logged.</w:t>
       </w:r>
     </w:p>
-    <w:bookmarkEnd w:id="86"/>
-    <w:bookmarkStart w:id="87" w:name="X4d00aaca200321aadfe4c2a1d4f04f3919b6069"/>
+    <w:bookmarkEnd w:id="88"/>
+    <w:bookmarkStart w:id="89" w:name="X4d00aaca200321aadfe4c2a1d4f04f3919b6069"/>
     <w:p>
       <w:pPr>
         <w:pStyle w:val="Heading2"/>
@@ -8256,8 +8622,8 @@
         <w:t xml:space="preserve">Audit log entries for the Asset Management module shall be retained for a minimum of 10 years to satisfy the statutory record-keeping requirements under the Uganda Companies Act and URA tax records obligations; entries older than 10 years may be archived to cold storage but must remain retrievable within 72 hours of an authorised retrieval request.</w:t>
       </w:r>
     </w:p>
-    <w:bookmarkEnd w:id="87"/>
-    <w:bookmarkStart w:id="88" w:name="X1c2c2f07406ed3dfa0f64e5feb6d0c19a67c5aa"/>
+    <w:bookmarkEnd w:id="89"/>
+    <w:bookmarkStart w:id="90" w:name="X1c2c2f07406ed3dfa0f64e5feb6d0c19a67c5aa"/>
     <w:p>
       <w:pPr>
         <w:pStyle w:val="Heading2"/>
@@ -8302,9 +8668,91 @@
         <w:t xml:space="preserve">The Physical Verification Discrepancy Report shall include a digital signature field for the Asset Manager and an approval date field to satisfy PPDA Act documentation requirements for public-sector tenants conducting statutory asset verification.</w:t>
       </w:r>
     </w:p>
-    <w:bookmarkEnd w:id="88"/>
-    <w:bookmarkEnd w:id="89"/>
-    <w:bookmarkStart w:id="95" w:name="X9649daa49851120a3bc03759b2e59e60d618852"/>
+    <w:bookmarkEnd w:id="90"/>
+    <w:bookmarkStart w:id="91" w:name="X8c801e1c676f21226a2649bb934f2bea55030fe"/>
+    <w:p>
+      <w:pPr>
+        <w:pStyle w:val="Heading2"/>
+      </w:pPr>
+      <w:r>
+        <w:t xml:space="preserve">8.8 Work Management and Reliability</w:t>
+      </w:r>
+    </w:p>
+    <w:p>
+      <w:pPr>
+        <w:pStyle w:val="FirstParagraph"/>
+      </w:pPr>
+      <w:r>
+        <w:rPr>
+          <w:b/>
+          <w:bCs/>
+        </w:rPr>
+        <w:t xml:space="preserve">NFR-ASSET-020:</w:t>
+      </w:r>
+      <w:r>
+        <w:t xml:space="preserve"> </w:t>
+      </w:r>
+      <w:r>
+        <w:t xml:space="preserve">The open work-order board shall return the first page of up to 100 filtered work orders from a tenant population of up to 50,000 open and historical work orders within â‰¤ 3 seconds at P95.</w:t>
+      </w:r>
+    </w:p>
+    <w:p>
+      <w:pPr>
+        <w:pStyle w:val="BodyText"/>
+      </w:pPr>
+      <w:r>
+        <w:rPr>
+          <w:b/>
+          <w:bCs/>
+        </w:rPr>
+        <w:t xml:space="preserve">NFR-ASSET-021:</w:t>
+      </w:r>
+      <w:r>
+        <w:t xml:space="preserve"> </w:t>
+      </w:r>
+      <w:r>
+        <w:t xml:space="preserve">The weekly scheduling board shall recompute labour-capacity conflicts and schedule-rule violations for up to 500 candidate work orders within â‰¤ 5 seconds at P95 after a planner changes the selected work week or crew filter.</w:t>
+      </w:r>
+    </w:p>
+    <w:p>
+      <w:pPr>
+        <w:pStyle w:val="BodyText"/>
+      </w:pPr>
+      <w:r>
+        <w:rPr>
+          <w:b/>
+          <w:bCs/>
+        </w:rPr>
+        <w:t xml:space="preserve">NFR-ASSET-022:</w:t>
+      </w:r>
+      <w:r>
+        <w:t xml:space="preserve"> </w:t>
+      </w:r>
+      <w:r>
+        <w:t xml:space="preserve">A validated condition event received from an external telemetry or inspection source shall be persisted and evaluated against alert thresholds within â‰¤ 60 seconds of receipt, excluding upstream connector outages outside the platform boundary.</w:t>
+      </w:r>
+    </w:p>
+    <w:p>
+      <w:pPr>
+        <w:pStyle w:val="BodyText"/>
+      </w:pPr>
+      <w:r>
+        <w:rPr>
+          <w:b/>
+          <w:bCs/>
+        </w:rPr>
+        <w:t xml:space="preserve">NFR-ASSET-023:</w:t>
+      </w:r>
+      <w:r>
+        <w:t xml:space="preserve"> </w:t>
+      </w:r>
+      <w:r>
+        <w:t xml:space="preserve">The mobile work-execution workflow defined in FR-ASSET-083 shall operate offline for at least 24 consecutive hours and synchronise all pending work-event records within â‰¤ 60 seconds of connectivity restoration for a batch of up to 100 locally stored events.</w:t>
+      </w:r>
+    </w:p>
+    <w:bookmarkEnd w:id="91"/>
+    <w:bookmarkEnd w:id="92"/>
+    <w:bookmarkStart w:id="98" w:name="X9649daa49851120a3bc03759b2e59e60d618852"/>
     <w:p>
       <w:pPr>
         <w:pStyle w:val="Heading1"/>
@@ -8313,7 +8761,7 @@
         <w:t xml:space="preserve">Traceability Matrix — Asset Management Module</w:t>
       </w:r>
     </w:p>
-    <w:bookmarkStart w:id="90" w:name="Xedfae3cd158e4dcaaff488e63c1c6c2d696fe7b"/>
+    <w:bookmarkStart w:id="93" w:name="Xedfae3cd158e4dcaaff488e63c1c6c2d696fe7b"/>
     <w:p>
       <w:pPr>
         <w:pStyle w:val="Heading2"/>
@@ -8342,8 +8790,8 @@
         <w:t xml:space="preserve">.</w:t>
       </w:r>
     </w:p>
-    <w:bookmarkEnd w:id="90"/>
-    <w:bookmarkStart w:id="91" w:name="X10d874b0055a0d6f3485f37131a3ff2e35008b5"/>
+    <w:bookmarkEnd w:id="93"/>
+    <w:bookmarkStart w:id="94" w:name="X10d874b0055a0d6f3485f37131a3ff2e35008b5"/>
     <w:p>
       <w:pPr>
         <w:pStyle w:val="Heading2"/>
@@ -8509,9 +8957,57 @@
           </w:p>
         </w:tc>
       </w:tr>
+      <w:tr>
+        <w:tc>
+          <w:tcPr/>
+          <w:p>
+            <w:pPr>
+              <w:pStyle w:val="Compact"/>
+            </w:pPr>
+            <w:r>
+              <w:t xml:space="preserve">BG-ASSET-006</w:t>
+            </w:r>
+          </w:p>
+        </w:tc>
+        <w:tc>
+          <w:tcPr/>
+          <w:p>
+            <w:pPr>
+              <w:pStyle w:val="Compact"/>
+            </w:pPr>
+            <w:r>
+              <w:t xml:space="preserve">Improve maintenance planning discipline, schedule compliance, and uptime for critical assets</w:t>
+            </w:r>
+          </w:p>
+        </w:tc>
+      </w:tr>
+      <w:tr>
+        <w:tc>
+          <w:tcPr/>
+          <w:p>
+            <w:pPr>
+              <w:pStyle w:val="Compact"/>
+            </w:pPr>
+            <w:r>
+              <w:t xml:space="preserve">BG-ASSET-007</w:t>
+            </w:r>
+          </w:p>
+        </w:tc>
+        <w:tc>
+          <w:tcPr/>
+          <w:p>
+            <w:pPr>
+              <w:pStyle w:val="Compact"/>
+            </w:pPr>
+            <w:r>
+              <w:t xml:space="preserve">Improve reliability and repair-versus-replace decisions using structured evidence</w:t>
+            </w:r>
+          </w:p>
+        </w:tc>
+      </w:tr>
     </w:tbl>
-    <w:bookmarkEnd w:id="91"/>
-    <w:bookmarkStart w:id="92" w:name="X31ee3050279a116ea1ecc20e9cfaeca77354fbb"/>
+    <w:bookmarkEnd w:id="94"/>
+    <w:bookmarkStart w:id="95" w:name="X31ee3050279a116ea1ecc20e9cfaeca77354fbb"/>
     <w:p>
       <w:pPr>
         <w:pStyle w:val="Heading2"/>
@@ -12686,9 +13182,892 @@
           </w:p>
         </w:tc>
       </w:tr>
+      <w:tr>
+        <w:tc>
+          <w:tcPr/>
+          <w:p>
+            <w:pPr>
+              <w:pStyle w:val="Compact"/>
+            </w:pPr>
+            <w:r>
+              <w:t xml:space="preserve">FR-ASSET-069</w:t>
+            </w:r>
+          </w:p>
+        </w:tc>
+        <w:tc>
+          <w:tcPr/>
+          <w:p>
+            <w:pPr>
+              <w:pStyle w:val="Compact"/>
+            </w:pPr>
+            <w:r>
+              <w:t xml:space="preserve">5A</w:t>
+            </w:r>
+          </w:p>
+        </w:tc>
+        <w:tc>
+          <w:tcPr/>
+          <w:p>
+            <w:pPr>
+              <w:pStyle w:val="Compact"/>
+            </w:pPr>
+            <w:r>
+              <w:t xml:space="preserve">Define functional locations and hierarchy</w:t>
+            </w:r>
+          </w:p>
+        </w:tc>
+        <w:tc>
+          <w:tcPr/>
+          <w:p>
+            <w:pPr>
+              <w:pStyle w:val="Compact"/>
+            </w:pPr>
+            <w:r>
+              <w:t xml:space="preserve">BG-ASSET-001, BG-ASSET-006</w:t>
+            </w:r>
+          </w:p>
+        </w:tc>
+        <w:tc>
+          <w:tcPr/>
+          <w:p>
+            <w:pPr>
+              <w:pStyle w:val="Compact"/>
+            </w:pPr>
+            <w:r>
+              <w:t xml:space="preserve">Create multi-level location tree and assign asset; verify hierarchy persisted and asset resolves to 1 active functional location.</w:t>
+            </w:r>
+          </w:p>
+        </w:tc>
+      </w:tr>
+      <w:tr>
+        <w:tc>
+          <w:tcPr/>
+          <w:p>
+            <w:pPr>
+              <w:pStyle w:val="Compact"/>
+            </w:pPr>
+            <w:r>
+              <w:t xml:space="preserve">FR-ASSET-070</w:t>
+            </w:r>
+          </w:p>
+        </w:tc>
+        <w:tc>
+          <w:tcPr/>
+          <w:p>
+            <w:pPr>
+              <w:pStyle w:val="Compact"/>
+            </w:pPr>
+            <w:r>
+              <w:t xml:space="preserve">5A</w:t>
+            </w:r>
+          </w:p>
+        </w:tc>
+        <w:tc>
+          <w:tcPr/>
+          <w:p>
+            <w:pPr>
+              <w:pStyle w:val="Compact"/>
+            </w:pPr>
+            <w:r>
+              <w:t xml:space="preserve">Asset criticality classification drives priority rules</w:t>
+            </w:r>
+          </w:p>
+        </w:tc>
+        <w:tc>
+          <w:tcPr/>
+          <w:p>
+            <w:pPr>
+              <w:pStyle w:val="Compact"/>
+            </w:pPr>
+            <w:r>
+              <w:t xml:space="preserve">BG-ASSET-006, BG-ASSET-007</w:t>
+            </w:r>
+          </w:p>
+        </w:tc>
+        <w:tc>
+          <w:tcPr/>
+          <w:p>
+            <w:pPr>
+              <w:pStyle w:val="Compact"/>
+            </w:pPr>
+            <w:r>
+              <w:t xml:space="preserve">Set asset to</w:t>
+            </w:r>
+            <w:r>
+              <w:t xml:space="preserve"> </w:t>
+            </w:r>
+            <w:r>
+              <w:rPr>
+                <w:i/>
+                <w:iCs/>
+              </w:rPr>
+              <w:t xml:space="preserve">Critical</w:t>
+            </w:r>
+            <w:r>
+              <w:t xml:space="preserve">; submit breakdown request; verify recommended priority and response window reflect criticality rule.</w:t>
+            </w:r>
+          </w:p>
+        </w:tc>
+      </w:tr>
+      <w:tr>
+        <w:tc>
+          <w:tcPr/>
+          <w:p>
+            <w:pPr>
+              <w:pStyle w:val="Compact"/>
+            </w:pPr>
+            <w:r>
+              <w:t xml:space="preserve">FR-ASSET-071</w:t>
+            </w:r>
+          </w:p>
+        </w:tc>
+        <w:tc>
+          <w:tcPr/>
+          <w:p>
+            <w:pPr>
+              <w:pStyle w:val="Compact"/>
+            </w:pPr>
+            <w:r>
+              <w:t xml:space="preserve">5A</w:t>
+            </w:r>
+          </w:p>
+        </w:tc>
+        <w:tc>
+          <w:tcPr/>
+          <w:p>
+            <w:pPr>
+              <w:pStyle w:val="Compact"/>
+            </w:pPr>
+            <w:r>
+              <w:t xml:space="preserve">Work-request intake with duplicate screening</w:t>
+            </w:r>
+          </w:p>
+        </w:tc>
+        <w:tc>
+          <w:tcPr/>
+          <w:p>
+            <w:pPr>
+              <w:pStyle w:val="Compact"/>
+            </w:pPr>
+            <w:r>
+              <w:t xml:space="preserve">BG-ASSET-006</w:t>
+            </w:r>
+          </w:p>
+        </w:tc>
+        <w:tc>
+          <w:tcPr/>
+          <w:p>
+            <w:pPr>
+              <w:pStyle w:val="Compact"/>
+            </w:pPr>
+            <w:r>
+              <w:t xml:space="preserve">Submit 2 similar requests for same asset; verify second request is flagged as possible duplicate.</w:t>
+            </w:r>
+          </w:p>
+        </w:tc>
+      </w:tr>
+      <w:tr>
+        <w:tc>
+          <w:tcPr/>
+          <w:p>
+            <w:pPr>
+              <w:pStyle w:val="Compact"/>
+            </w:pPr>
+            <w:r>
+              <w:t xml:space="preserve">FR-ASSET-072</w:t>
+            </w:r>
+          </w:p>
+        </w:tc>
+        <w:tc>
+          <w:tcPr/>
+          <w:p>
+            <w:pPr>
+              <w:pStyle w:val="Compact"/>
+            </w:pPr>
+            <w:r>
+              <w:t xml:space="preserve">5A</w:t>
+            </w:r>
+          </w:p>
+        </w:tc>
+        <w:tc>
+          <w:tcPr/>
+          <w:p>
+            <w:pPr>
+              <w:pStyle w:val="Compact"/>
+            </w:pPr>
+            <w:r>
+              <w:t xml:space="preserve">Screen request to reject, merge, or convert</w:t>
+            </w:r>
+          </w:p>
+        </w:tc>
+        <w:tc>
+          <w:tcPr/>
+          <w:p>
+            <w:pPr>
+              <w:pStyle w:val="Compact"/>
+            </w:pPr>
+            <w:r>
+              <w:t xml:space="preserve">BG-ASSET-006</w:t>
+            </w:r>
+          </w:p>
+        </w:tc>
+        <w:tc>
+          <w:tcPr/>
+          <w:p>
+            <w:pPr>
+              <w:pStyle w:val="Compact"/>
+            </w:pPr>
+            <w:r>
+              <w:t xml:space="preserve">Screen request and convert to work order; verify request status updated and work-order link stored.</w:t>
+            </w:r>
+          </w:p>
+        </w:tc>
+      </w:tr>
+      <w:tr>
+        <w:tc>
+          <w:tcPr/>
+          <w:p>
+            <w:pPr>
+              <w:pStyle w:val="Compact"/>
+            </w:pPr>
+            <w:r>
+              <w:t xml:space="preserve">FR-ASSET-073</w:t>
+            </w:r>
+          </w:p>
+        </w:tc>
+        <w:tc>
+          <w:tcPr/>
+          <w:p>
+            <w:pPr>
+              <w:pStyle w:val="Compact"/>
+            </w:pPr>
+            <w:r>
+              <w:t xml:space="preserve">5A</w:t>
+            </w:r>
+          </w:p>
+        </w:tc>
+        <w:tc>
+          <w:tcPr/>
+          <w:p>
+            <w:pPr>
+              <w:pStyle w:val="Compact"/>
+            </w:pPr>
+            <w:r>
+              <w:t xml:space="preserve">Planning package on work order</w:t>
+            </w:r>
+          </w:p>
+        </w:tc>
+        <w:tc>
+          <w:tcPr/>
+          <w:p>
+            <w:pPr>
+              <w:pStyle w:val="Compact"/>
+            </w:pPr>
+            <w:r>
+              <w:t xml:space="preserve">BG-ASSET-006</w:t>
+            </w:r>
+          </w:p>
+        </w:tc>
+        <w:tc>
+          <w:tcPr/>
+          <w:p>
+            <w:pPr>
+              <w:pStyle w:val="Compact"/>
+            </w:pPr>
+            <w:r>
+              <w:t xml:space="preserve">Plan work order with labour, materials, and permit steps; verify planning package fields saved and rendered.</w:t>
+            </w:r>
+          </w:p>
+        </w:tc>
+      </w:tr>
+      <w:tr>
+        <w:tc>
+          <w:tcPr/>
+          <w:p>
+            <w:pPr>
+              <w:pStyle w:val="Compact"/>
+            </w:pPr>
+            <w:r>
+              <w:t xml:space="preserve">FR-ASSET-074</w:t>
+            </w:r>
+          </w:p>
+        </w:tc>
+        <w:tc>
+          <w:tcPr/>
+          <w:p>
+            <w:pPr>
+              <w:pStyle w:val="Compact"/>
+            </w:pPr>
+            <w:r>
+              <w:t xml:space="preserve">5A</w:t>
+            </w:r>
+          </w:p>
+        </w:tc>
+        <w:tc>
+          <w:tcPr/>
+          <w:p>
+            <w:pPr>
+              <w:pStyle w:val="Compact"/>
+            </w:pPr>
+            <w:r>
+              <w:t xml:space="preserve">Weekly scheduling board with over-allocation guard</w:t>
+            </w:r>
+          </w:p>
+        </w:tc>
+        <w:tc>
+          <w:tcPr/>
+          <w:p>
+            <w:pPr>
+              <w:pStyle w:val="Compact"/>
+            </w:pPr>
+            <w:r>
+              <w:t xml:space="preserve">BG-ASSET-006</w:t>
+            </w:r>
+          </w:p>
+        </w:tc>
+        <w:tc>
+          <w:tcPr/>
+          <w:p>
+            <w:pPr>
+              <w:pStyle w:val="Compact"/>
+            </w:pPr>
+            <w:r>
+              <w:t xml:space="preserve">Overbook a crew; verify conflict shown and override reason required.</w:t>
+            </w:r>
+          </w:p>
+        </w:tc>
+      </w:tr>
+      <w:tr>
+        <w:tc>
+          <w:tcPr/>
+          <w:p>
+            <w:pPr>
+              <w:pStyle w:val="Compact"/>
+            </w:pPr>
+            <w:r>
+              <w:t xml:space="preserve">FR-ASSET-075</w:t>
+            </w:r>
+          </w:p>
+        </w:tc>
+        <w:tc>
+          <w:tcPr/>
+          <w:p>
+            <w:pPr>
+              <w:pStyle w:val="Compact"/>
+            </w:pPr>
+            <w:r>
+              <w:t xml:space="preserve">5A</w:t>
+            </w:r>
+          </w:p>
+        </w:tc>
+        <w:tc>
+          <w:tcPr/>
+          <w:p>
+            <w:pPr>
+              <w:pStyle w:val="Compact"/>
+            </w:pPr>
+            <w:r>
+              <w:t xml:space="preserve">Planned/unplanned classification and backlog age</w:t>
+            </w:r>
+          </w:p>
+        </w:tc>
+        <w:tc>
+          <w:tcPr/>
+          <w:p>
+            <w:pPr>
+              <w:pStyle w:val="Compact"/>
+            </w:pPr>
+            <w:r>
+              <w:t xml:space="preserve">BG-ASSET-006, BG-ASSET-007</w:t>
+            </w:r>
+          </w:p>
+        </w:tc>
+        <w:tc>
+          <w:tcPr/>
+          <w:p>
+            <w:pPr>
+              <w:pStyle w:val="Compact"/>
+            </w:pPr>
+            <w:r>
+              <w:t xml:space="preserve">Complete corrective job after 12 days; verify</w:t>
+            </w:r>
+            <w:r>
+              <w:t xml:space="preserve"> </w:t>
+            </w:r>
+            <w:r>
+              <w:rPr>
+                <w:rStyle w:val="VerbatimChar"/>
+              </w:rPr>
+              <w:t xml:space="preserve">unplanned</w:t>
+            </w:r>
+            <w:r>
+              <w:t xml:space="preserve"> </w:t>
+            </w:r>
+            <w:r>
+              <w:t xml:space="preserve">classification and backlog age = 12 days.</w:t>
+            </w:r>
+          </w:p>
+        </w:tc>
+      </w:tr>
+      <w:tr>
+        <w:tc>
+          <w:tcPr/>
+          <w:p>
+            <w:pPr>
+              <w:pStyle w:val="Compact"/>
+            </w:pPr>
+            <w:r>
+              <w:t xml:space="preserve">FR-ASSET-076</w:t>
+            </w:r>
+          </w:p>
+        </w:tc>
+        <w:tc>
+          <w:tcPr/>
+          <w:p>
+            <w:pPr>
+              <w:pStyle w:val="Compact"/>
+            </w:pPr>
+            <w:r>
+              <w:t xml:space="preserve">5A</w:t>
+            </w:r>
+          </w:p>
+        </w:tc>
+        <w:tc>
+          <w:tcPr/>
+          <w:p>
+            <w:pPr>
+              <w:pStyle w:val="Compact"/>
+            </w:pPr>
+            <w:r>
+              <w:t xml:space="preserve">Shutdown/turnaround package</w:t>
+            </w:r>
+          </w:p>
+        </w:tc>
+        <w:tc>
+          <w:tcPr/>
+          <w:p>
+            <w:pPr>
+              <w:pStyle w:val="Compact"/>
+            </w:pPr>
+            <w:r>
+              <w:t xml:space="preserve">BG-ASSET-006</w:t>
+            </w:r>
+          </w:p>
+        </w:tc>
+        <w:tc>
+          <w:tcPr/>
+          <w:p>
+            <w:pPr>
+              <w:pStyle w:val="Compact"/>
+            </w:pPr>
+            <w:r>
+              <w:t xml:space="preserve">Group 4 work orders into outage package; verify shared window, coordinator, and readiness summary.</w:t>
+            </w:r>
+          </w:p>
+        </w:tc>
+      </w:tr>
+      <w:tr>
+        <w:tc>
+          <w:tcPr/>
+          <w:p>
+            <w:pPr>
+              <w:pStyle w:val="Compact"/>
+            </w:pPr>
+            <w:r>
+              <w:t xml:space="preserve">FR-ASSET-077</w:t>
+            </w:r>
+          </w:p>
+        </w:tc>
+        <w:tc>
+          <w:tcPr/>
+          <w:p>
+            <w:pPr>
+              <w:pStyle w:val="Compact"/>
+            </w:pPr>
+            <w:r>
+              <w:t xml:space="preserve">6A</w:t>
+            </w:r>
+          </w:p>
+        </w:tc>
+        <w:tc>
+          <w:tcPr/>
+          <w:p>
+            <w:pPr>
+              <w:pStyle w:val="Compact"/>
+            </w:pPr>
+            <w:r>
+              <w:t xml:space="preserve">Reserve MRO materials for work order</w:t>
+            </w:r>
+          </w:p>
+        </w:tc>
+        <w:tc>
+          <w:tcPr/>
+          <w:p>
+            <w:pPr>
+              <w:pStyle w:val="Compact"/>
+            </w:pPr>
+            <w:r>
+              <w:t xml:space="preserve">BG-ASSET-006</w:t>
+            </w:r>
+          </w:p>
+        </w:tc>
+        <w:tc>
+          <w:tcPr/>
+          <w:p>
+            <w:pPr>
+              <w:pStyle w:val="Compact"/>
+            </w:pPr>
+            <w:r>
+              <w:t xml:space="preserve">Reserve 3 stock items against work order; verify reservations exist and unavailable quantity is flagged.</w:t>
+            </w:r>
+          </w:p>
+        </w:tc>
+      </w:tr>
+      <w:tr>
+        <w:tc>
+          <w:tcPr/>
+          <w:p>
+            <w:pPr>
+              <w:pStyle w:val="Compact"/>
+            </w:pPr>
+            <w:r>
+              <w:t xml:space="preserve">FR-ASSET-078</w:t>
+            </w:r>
+          </w:p>
+        </w:tc>
+        <w:tc>
+          <w:tcPr/>
+          <w:p>
+            <w:pPr>
+              <w:pStyle w:val="Compact"/>
+            </w:pPr>
+            <w:r>
+              <w:t xml:space="preserve">6A</w:t>
+            </w:r>
+          </w:p>
+        </w:tc>
+        <w:tc>
+          <w:tcPr/>
+          <w:p>
+            <w:pPr>
+              <w:pStyle w:val="Compact"/>
+            </w:pPr>
+            <w:r>
+              <w:t xml:space="preserve">Material shortage exception and linked supply request</w:t>
+            </w:r>
+          </w:p>
+        </w:tc>
+        <w:tc>
+          <w:tcPr/>
+          <w:p>
+            <w:pPr>
+              <w:pStyle w:val="Compact"/>
+            </w:pPr>
+            <w:r>
+              <w:t xml:space="preserve">BG-ASSET-006</w:t>
+            </w:r>
+          </w:p>
+        </w:tc>
+        <w:tc>
+          <w:tcPr/>
+          <w:p>
+            <w:pPr>
+              <w:pStyle w:val="Compact"/>
+            </w:pPr>
+            <w:r>
+              <w:t xml:space="preserve">Reserve unavailable part; verify shortage exception created and linked procurement or transfer request available.</w:t>
+            </w:r>
+          </w:p>
+        </w:tc>
+      </w:tr>
+      <w:tr>
+        <w:tc>
+          <w:tcPr/>
+          <w:p>
+            <w:pPr>
+              <w:pStyle w:val="Compact"/>
+            </w:pPr>
+            <w:r>
+              <w:t xml:space="preserve">FR-ASSET-079</w:t>
+            </w:r>
+          </w:p>
+        </w:tc>
+        <w:tc>
+          <w:tcPr/>
+          <w:p>
+            <w:pPr>
+              <w:pStyle w:val="Compact"/>
+            </w:pPr>
+            <w:r>
+              <w:t xml:space="preserve">6A</w:t>
+            </w:r>
+          </w:p>
+        </w:tc>
+        <w:tc>
+          <w:tcPr/>
+          <w:p>
+            <w:pPr>
+              <w:pStyle w:val="Compact"/>
+            </w:pPr>
+            <w:r>
+              <w:t xml:space="preserve">Condition-event threshold evaluation</w:t>
+            </w:r>
+          </w:p>
+        </w:tc>
+        <w:tc>
+          <w:tcPr/>
+          <w:p>
+            <w:pPr>
+              <w:pStyle w:val="Compact"/>
+            </w:pPr>
+            <w:r>
+              <w:t xml:space="preserve">BG-ASSET-006, BG-ASSET-007</w:t>
+            </w:r>
+          </w:p>
+        </w:tc>
+        <w:tc>
+          <w:tcPr/>
+          <w:p>
+            <w:pPr>
+              <w:pStyle w:val="Compact"/>
+            </w:pPr>
+            <w:r>
+              <w:t xml:space="preserve">Submit meter reading above threshold; verify inspection or corrective action recommendation is generated.</w:t>
+            </w:r>
+          </w:p>
+        </w:tc>
+      </w:tr>
+      <w:tr>
+        <w:tc>
+          <w:tcPr/>
+          <w:p>
+            <w:pPr>
+              <w:pStyle w:val="Compact"/>
+            </w:pPr>
+            <w:r>
+              <w:t xml:space="preserve">FR-ASSET-080</w:t>
+            </w:r>
+          </w:p>
+        </w:tc>
+        <w:tc>
+          <w:tcPr/>
+          <w:p>
+            <w:pPr>
+              <w:pStyle w:val="Compact"/>
+            </w:pPr>
+            <w:r>
+              <w:t xml:space="preserve">6A</w:t>
+            </w:r>
+          </w:p>
+        </w:tc>
+        <w:tc>
+          <w:tcPr/>
+          <w:p>
+            <w:pPr>
+              <w:pStyle w:val="Compact"/>
+            </w:pPr>
+            <w:r>
+              <w:t xml:space="preserve">Structured closeout with failure coding</w:t>
+            </w:r>
+          </w:p>
+        </w:tc>
+        <w:tc>
+          <w:tcPr/>
+          <w:p>
+            <w:pPr>
+              <w:pStyle w:val="Compact"/>
+            </w:pPr>
+            <w:r>
+              <w:t xml:space="preserve">BG-ASSET-007</w:t>
+            </w:r>
+          </w:p>
+        </w:tc>
+        <w:tc>
+          <w:tcPr/>
+          <w:p>
+            <w:pPr>
+              <w:pStyle w:val="Compact"/>
+            </w:pPr>
+            <w:r>
+              <w:t xml:space="preserve">Attempt to close corrective work order without failure code; verify rejection.</w:t>
+            </w:r>
+          </w:p>
+        </w:tc>
+      </w:tr>
+      <w:tr>
+        <w:tc>
+          <w:tcPr/>
+          <w:p>
+            <w:pPr>
+              <w:pStyle w:val="Compact"/>
+            </w:pPr>
+            <w:r>
+              <w:t xml:space="preserve">FR-ASSET-081</w:t>
+            </w:r>
+          </w:p>
+        </w:tc>
+        <w:tc>
+          <w:tcPr/>
+          <w:p>
+            <w:pPr>
+              <w:pStyle w:val="Compact"/>
+            </w:pPr>
+            <w:r>
+              <w:t xml:space="preserve">6A</w:t>
+            </w:r>
+          </w:p>
+        </w:tc>
+        <w:tc>
+          <w:tcPr/>
+          <w:p>
+            <w:pPr>
+              <w:pStyle w:val="Compact"/>
+            </w:pPr>
+            <w:r>
+              <w:t xml:space="preserve">Reliability dashboard metrics</w:t>
+            </w:r>
+          </w:p>
+        </w:tc>
+        <w:tc>
+          <w:tcPr/>
+          <w:p>
+            <w:pPr>
+              <w:pStyle w:val="Compact"/>
+            </w:pPr>
+            <w:r>
+              <w:t xml:space="preserve">BG-ASSET-006, BG-ASSET-007</w:t>
+            </w:r>
+          </w:p>
+        </w:tc>
+        <w:tc>
+          <w:tcPr/>
+          <w:p>
+            <w:pPr>
+              <w:pStyle w:val="Compact"/>
+            </w:pPr>
+            <w:r>
+              <w:t xml:space="preserve">Open dashboard for date range; verify PM compliance, MTBF, MTTR, and backlog metrics are present.</w:t>
+            </w:r>
+          </w:p>
+        </w:tc>
+      </w:tr>
+      <w:tr>
+        <w:tc>
+          <w:tcPr/>
+          <w:p>
+            <w:pPr>
+              <w:pStyle w:val="Compact"/>
+            </w:pPr>
+            <w:r>
+              <w:t xml:space="preserve">FR-ASSET-082</w:t>
+            </w:r>
+          </w:p>
+        </w:tc>
+        <w:tc>
+          <w:tcPr/>
+          <w:p>
+            <w:pPr>
+              <w:pStyle w:val="Compact"/>
+            </w:pPr>
+            <w:r>
+              <w:t xml:space="preserve">6A</w:t>
+            </w:r>
+          </w:p>
+        </w:tc>
+        <w:tc>
+          <w:tcPr/>
+          <w:p>
+            <w:pPr>
+              <w:pStyle w:val="Compact"/>
+            </w:pPr>
+            <w:r>
+              <w:t xml:space="preserve">Bad-actor detection and root-cause workflow</w:t>
+            </w:r>
+          </w:p>
+        </w:tc>
+        <w:tc>
+          <w:tcPr/>
+          <w:p>
+            <w:pPr>
+              <w:pStyle w:val="Compact"/>
+            </w:pPr>
+            <w:r>
+              <w:t xml:space="preserve">BG-ASSET-007</w:t>
+            </w:r>
+          </w:p>
+        </w:tc>
+        <w:tc>
+          <w:tcPr/>
+          <w:p>
+            <w:pPr>
+              <w:pStyle w:val="Compact"/>
+            </w:pPr>
+            <w:r>
+              <w:t xml:space="preserve">Trigger repeat-failure threshold; verify bad-actor flag and root-cause workflow action available.</w:t>
+            </w:r>
+          </w:p>
+        </w:tc>
+      </w:tr>
+      <w:tr>
+        <w:tc>
+          <w:tcPr/>
+          <w:p>
+            <w:pPr>
+              <w:pStyle w:val="Compact"/>
+            </w:pPr>
+            <w:r>
+              <w:t xml:space="preserve">FR-ASSET-083</w:t>
+            </w:r>
+          </w:p>
+        </w:tc>
+        <w:tc>
+          <w:tcPr/>
+          <w:p>
+            <w:pPr>
+              <w:pStyle w:val="Compact"/>
+            </w:pPr>
+            <w:r>
+              <w:t xml:space="preserve">6A</w:t>
+            </w:r>
+          </w:p>
+        </w:tc>
+        <w:tc>
+          <w:tcPr/>
+          <w:p>
+            <w:pPr>
+              <w:pStyle w:val="Compact"/>
+            </w:pPr>
+            <w:r>
+              <w:t xml:space="preserve">Mobile offline work execution</w:t>
+            </w:r>
+          </w:p>
+        </w:tc>
+        <w:tc>
+          <w:tcPr/>
+          <w:p>
+            <w:pPr>
+              <w:pStyle w:val="Compact"/>
+            </w:pPr>
+            <w:r>
+              <w:t xml:space="preserve">BG-ASSET-006</w:t>
+            </w:r>
+          </w:p>
+        </w:tc>
+        <w:tc>
+          <w:tcPr/>
+          <w:p>
+            <w:pPr>
+              <w:pStyle w:val="Compact"/>
+            </w:pPr>
+            <w:r>
+              <w:t xml:space="preserve">Complete checklist and parts usage offline; reconnect; verify records sync and timestamps preserved.</w:t>
+            </w:r>
+          </w:p>
+        </w:tc>
+      </w:tr>
     </w:tbl>
-    <w:bookmarkEnd w:id="92"/>
-    <w:bookmarkStart w:id="93" w:name="Xd2a5037b8c4eb7964406f53b555ff9079101db8"/>
+    <w:bookmarkEnd w:id="95"/>
+    <w:bookmarkStart w:id="96" w:name="Xd2a5037b8c4eb7964406f53b555ff9079101db8"/>
     <w:p>
       <w:pPr>
         <w:pStyle w:val="Heading2"/>
@@ -12796,14 +14175,64 @@
         <w:t xml:space="preserve">— Section 6.2 specifies in-app and email notifications. Confirm whether SMS via Africa's Talking should also be sent for insurance expiry alerts, and which tenant subscription plans include SMS notifications.</w:t>
       </w:r>
     </w:p>
-    <w:bookmarkEnd w:id="93"/>
-    <w:bookmarkStart w:id="94" w:name="X9aabe3eedb635e78b3635f65b362731cc8605fb"/>
+    <w:bookmarkEnd w:id="96"/>
+    <w:bookmarkStart w:id="97" w:name="X9aabe3eedb635e78b3635f65b362731cc8605fb"/>
     <w:p>
       <w:pPr>
         <w:pStyle w:val="Heading2"/>
       </w:pPr>
       <w:r>
         <w:t xml:space="preserve">9.5 LaTeX Formula Verification Notes</w:t>
+      </w:r>
+    </w:p>
+    <w:p>
+      <w:pPr>
+        <w:pStyle w:val="FirstParagraph"/>
+      </w:pPr>
+      <w:r>
+        <w:t xml:space="preserve">Additional context gaps introduced by Sections 5A and 6A:</w:t>
+      </w:r>
+    </w:p>
+    <w:p>
+      <w:pPr>
+        <w:pStyle w:val="Compact"/>
+        <w:numPr>
+          <w:ilvl w:val="0"/>
+          <w:numId w:val="1019"/>
+        </w:numPr>
+      </w:pPr>
+      <w:r>
+        <w:rPr>
+          <w:rStyle w:val="VerbatimChar"/>
+        </w:rPr>
+        <w:t xml:space="preserve">[CONTEXT-GAP: asset criticality model]</w:t>
+      </w:r>
+      <w:r>
+        <w:t xml:space="preserve"> </w:t>
+      </w:r>
+      <w:r>
+        <w:t xml:space="preserve">â€” Confirm the default criticality scale, scoring method, and whether LonghornERP will support categorical criticality only or probability-versus-consequence scoring at tenant level.</w:t>
+      </w:r>
+    </w:p>
+    <w:p>
+      <w:pPr>
+        <w:pStyle w:val="Compact"/>
+        <w:numPr>
+          <w:ilvl w:val="0"/>
+          <w:numId w:val="1019"/>
+        </w:numPr>
+      </w:pPr>
+      <w:r>
+        <w:rPr>
+          <w:rStyle w:val="VerbatimChar"/>
+        </w:rPr>
+        <w:t xml:space="preserve">[CONTEXT-GAP: condition-event source scope]</w:t>
+      </w:r>
+      <w:r>
+        <w:t xml:space="preserve"> </w:t>
+      </w:r>
+      <w:r>
+        <w:t xml:space="preserve">â€” Confirm which external sources are in scope for first release: manual inspections only, mobile meter capture, or direct telemetry ingestion through the integration layer.</w:t>
       </w:r>
     </w:p>
     <w:p>
@@ -13384,8 +14813,8 @@
         </w:tc>
       </w:tr>
     </w:tbl>
-    <w:bookmarkEnd w:id="94"/>
-    <w:bookmarkEnd w:id="95"/>
+    <w:bookmarkEnd w:id="97"/>
+    <w:bookmarkEnd w:id="98"/>
     <w:sectPr>
       <w:footerReference r:id="rId9" w:type="default"/>
       <w:headerReference r:id="rId10" w:type="default"/>
@@ -13920,6 +15349,9 @@
     <w:abstractNumId w:val="991"/>
   </w:num>
   <w:num w:numId="1018">
+    <w:abstractNumId w:val="991"/>
+  </w:num>
+  <w:num w:numId="1019">
     <w:abstractNumId w:val="991"/>
   </w:num>
 </w:numbering>

</xml_diff>